<commit_message>
Major SEO fixes: schemas, redirects, analytics, contact form
- BlogPosting schema on all 40 blog post pages (headline, author,
  publisher, datePublished, image, articleSection)
- 60+ 301 redirects from old WordPress URLs to new Astro paths
  (services, blogs, pages, sitemaps, categories, authors)
- robots.txt updated to point to correct Astro sitemap
- GA4 placeholder added to Layout (replace G-XXXXXXXXXX with real ID)
- Contact form wired to Formspree for email delivery

Co-Authored-By: Claude Opus 4.6 (1M context) <noreply@anthropic.com>
</commit_message>
<xml_diff>
--- a/SEO-AUDIT-REPORT.docx
+++ b/SEO-AUDIT-REPORT.docx
@@ -52,7 +52,13 @@
           <w:color w:val="6B8A95"/>
         </w:rPr>
         <w:br/>
-        <w:t>Prepared by: RICH</w:t>
+        <w:t>Prepared by: R</w:t>
+      </w:r>
+      <w:r>
+        <w:rPr>
+          <w:color w:val="6B8A95"/>
+        </w:rPr>
+        <w:t>ICH</w:t>
       </w:r>
       <w:r>
         <w:rPr>
@@ -6186,7 +6192,13 @@
         <w:spacing w:after="120"/>
       </w:pPr>
       <w:r>
-        <w:t>Report generated by SEO Analysis Sub-Agent for Rich Marketing Team</w:t>
+        <w:t>Report generated by SEO Analysis Sub-Agent for R</w:t>
+      </w:r>
+      <w:r>
+        <w:t>ICH</w:t>
+      </w:r>
+      <w:r>
+        <w:t xml:space="preserve"> Marketing Team</w:t>
       </w:r>
     </w:p>
     <w:p>
@@ -6208,7 +6220,23 @@
           <w:color w:val="6B8A95"/>
           <w:sz w:val="18"/>
         </w:rPr>
-        <w:t>Report generated by Rich Marketing Team SEO Analysis</w:t>
+        <w:t>Report generated by R</w:t>
+      </w:r>
+      <w:r>
+        <w:rPr>
+          <w:i/>
+          <w:color w:val="6B8A95"/>
+          <w:sz w:val="18"/>
+        </w:rPr>
+        <w:t>ICH</w:t>
+      </w:r>
+      <w:r>
+        <w:rPr>
+          <w:i/>
+          <w:color w:val="6B8A95"/>
+          <w:sz w:val="18"/>
+        </w:rPr>
+        <w:t xml:space="preserve"> Marketing Team SEO Analysis</w:t>
       </w:r>
       <w:r>
         <w:rPr>

</xml_diff>